<commit_message>
chore(modelos): atualiza arquivos de cursos
</commit_message>
<xml_diff>
--- a/cursos/Suporte Básico de Vida V2.docx
+++ b/cursos/Suporte Básico de Vida V2.docx
@@ -48,7 +48,7 @@
                     <a:blip r:embed="rId7" cstate="print">
                       <a:extLst>
                         <a:ext uri="{28A0092B-C50C-407E-A947-70E740481C1C}">
-                          <a14:useLocalDpi xmlns:a14="http://schemas.microsoft.com/office/drawing/2010/main" xmlns:wps="http://schemas.microsoft.com/office/word/2010/wordprocessingShape" xmlns:wpi="http://schemas.microsoft.com/office/word/2010/wordprocessingInk" xmlns:wpg="http://schemas.microsoft.com/office/word/2010/wordprocessingGroup" xmlns:w15="http://schemas.microsoft.com/office/word/2012/wordml" xmlns:w14="http://schemas.microsoft.com/office/word/2010/wordml" xmlns:w="http://schemas.openxmlformats.org/wordprocessingml/2006/main" xmlns:w10="urn:schemas-microsoft-com:office:word" xmlns:wp14="http://schemas.microsoft.com/office/word/2010/wordprocessingDrawing" xmlns:v="urn:schemas-microsoft-com:vml" xmlns:o="urn:schemas-microsoft-com:office:office" xmlns:mc="http://schemas.openxmlformats.org/markup-compatibility/2006" xmlns:wpc="http://schemas.microsoft.com/office/word/2010/wordprocessingCanvas" xmlns="" val="0"/>
+                          <a14:useLocalDpi xmlns="" xmlns:wpc="http://schemas.microsoft.com/office/word/2010/wordprocessingCanvas" xmlns:mc="http://schemas.openxmlformats.org/markup-compatibility/2006" xmlns:o="urn:schemas-microsoft-com:office:office" xmlns:v="urn:schemas-microsoft-com:vml" xmlns:wp14="http://schemas.microsoft.com/office/word/2010/wordprocessingDrawing" xmlns:w10="urn:schemas-microsoft-com:office:word" xmlns:w="http://schemas.openxmlformats.org/wordprocessingml/2006/main" xmlns:w14="http://schemas.microsoft.com/office/word/2010/wordml" xmlns:w15="http://schemas.microsoft.com/office/word/2012/wordml" xmlns:wpg="http://schemas.microsoft.com/office/word/2010/wordprocessingGroup" xmlns:wpi="http://schemas.microsoft.com/office/word/2010/wordprocessingInk" xmlns:wps="http://schemas.microsoft.com/office/word/2010/wordprocessingShape" xmlns:a14="http://schemas.microsoft.com/office/drawing/2010/main" val="0"/>
                         </a:ext>
                       </a:extLst>
                     </a:blip>
@@ -109,7 +109,7 @@
                     <a:blip r:embed="rId8">
                       <a:extLst>
                         <a:ext uri="{28A0092B-C50C-407E-A947-70E740481C1C}">
-                          <a14:useLocalDpi xmlns:a14="http://schemas.microsoft.com/office/drawing/2010/main" xmlns:wps="http://schemas.microsoft.com/office/word/2010/wordprocessingShape" xmlns:wpi="http://schemas.microsoft.com/office/word/2010/wordprocessingInk" xmlns:wpg="http://schemas.microsoft.com/office/word/2010/wordprocessingGroup" xmlns:w15="http://schemas.microsoft.com/office/word/2012/wordml" xmlns:w14="http://schemas.microsoft.com/office/word/2010/wordml" xmlns:w="http://schemas.openxmlformats.org/wordprocessingml/2006/main" xmlns:w10="urn:schemas-microsoft-com:office:word" xmlns:wp14="http://schemas.microsoft.com/office/word/2010/wordprocessingDrawing" xmlns:v="urn:schemas-microsoft-com:vml" xmlns:o="urn:schemas-microsoft-com:office:office" xmlns:mc="http://schemas.openxmlformats.org/markup-compatibility/2006" xmlns:wpc="http://schemas.microsoft.com/office/word/2010/wordprocessingCanvas" xmlns="" val="0"/>
+                          <a14:useLocalDpi xmlns="" xmlns:wpc="http://schemas.microsoft.com/office/word/2010/wordprocessingCanvas" xmlns:mc="http://schemas.openxmlformats.org/markup-compatibility/2006" xmlns:o="urn:schemas-microsoft-com:office:office" xmlns:v="urn:schemas-microsoft-com:vml" xmlns:wp14="http://schemas.microsoft.com/office/word/2010/wordprocessingDrawing" xmlns:w10="urn:schemas-microsoft-com:office:word" xmlns:w="http://schemas.openxmlformats.org/wordprocessingml/2006/main" xmlns:w14="http://schemas.microsoft.com/office/word/2010/wordml" xmlns:w15="http://schemas.microsoft.com/office/word/2012/wordml" xmlns:wpg="http://schemas.microsoft.com/office/word/2010/wordprocessingGroup" xmlns:wpi="http://schemas.microsoft.com/office/word/2010/wordprocessingInk" xmlns:wps="http://schemas.microsoft.com/office/word/2010/wordprocessingShape" xmlns:a14="http://schemas.microsoft.com/office/drawing/2010/main" val="0"/>
                         </a:ext>
                       </a:extLst>
                     </a:blip>
@@ -610,7 +610,7 @@
                     <a:blip r:embed="rId9">
                       <a:extLst>
                         <a:ext uri="{28A0092B-C50C-407E-A947-70E740481C1C}">
-                          <a14:useLocalDpi xmlns:a14="http://schemas.microsoft.com/office/drawing/2010/main" xmlns:wps="http://schemas.microsoft.com/office/word/2010/wordprocessingShape" xmlns:wpi="http://schemas.microsoft.com/office/word/2010/wordprocessingInk" xmlns:wpg="http://schemas.microsoft.com/office/word/2010/wordprocessingGroup" xmlns:w15="http://schemas.microsoft.com/office/word/2012/wordml" xmlns:w14="http://schemas.microsoft.com/office/word/2010/wordml" xmlns:w="http://schemas.openxmlformats.org/wordprocessingml/2006/main" xmlns:w10="urn:schemas-microsoft-com:office:word" xmlns:wp14="http://schemas.microsoft.com/office/word/2010/wordprocessingDrawing" xmlns:v="urn:schemas-microsoft-com:vml" xmlns:o="urn:schemas-microsoft-com:office:office" xmlns:mc="http://schemas.openxmlformats.org/markup-compatibility/2006" xmlns:wpc="http://schemas.microsoft.com/office/word/2010/wordprocessingCanvas" xmlns="" val="0"/>
+                          <a14:useLocalDpi xmlns="" xmlns:wpc="http://schemas.microsoft.com/office/word/2010/wordprocessingCanvas" xmlns:mc="http://schemas.openxmlformats.org/markup-compatibility/2006" xmlns:o="urn:schemas-microsoft-com:office:office" xmlns:v="urn:schemas-microsoft-com:vml" xmlns:wp14="http://schemas.microsoft.com/office/word/2010/wordprocessingDrawing" xmlns:w10="urn:schemas-microsoft-com:office:word" xmlns:w="http://schemas.openxmlformats.org/wordprocessingml/2006/main" xmlns:w14="http://schemas.microsoft.com/office/word/2010/wordml" xmlns:w15="http://schemas.microsoft.com/office/word/2012/wordml" xmlns:wpg="http://schemas.microsoft.com/office/word/2010/wordprocessingGroup" xmlns:wpi="http://schemas.microsoft.com/office/word/2010/wordprocessingInk" xmlns:wps="http://schemas.microsoft.com/office/word/2010/wordprocessingShape" xmlns:a14="http://schemas.microsoft.com/office/drawing/2010/main" val="0"/>
                         </a:ext>
                       </a:extLst>
                     </a:blip>
@@ -665,22 +665,27 @@
           <w:sz w:val="32"/>
           <w:szCs w:val="32"/>
         </w:rPr>
-        <w:t>Carlos Alexandre R.  Faria                                                                                                                                                                                                                                                   Reg.MTE0056818/MG                                                                        Aluno(a)                                                                                                                                                                                                                                                                                                                                                                                                                                                      Coren MG 001.312.974                                                  CPF___________________                                                                                                               Reg.  CBMMG Nº F 0004348</w:t>
+        <w:t>Carlos Alexandre R.  Faria                                                                                                                                                                                                                                                   Reg.MTE0056818/MG                                                                        Aluno(a)                                                                                                                                                                                                                                                                                                                                                                                                                                                      Coren MG 001.312.974                                                  CPF</w:t>
+      </w:r>
+      <w:r>
+        <w:rPr>
+          <w:rFonts w:eastAsia="Corsiva" w:cs="Corsiva"/>
+          <w:sz w:val="32"/>
+          <w:szCs w:val="32"/>
+        </w:rPr>
+        <w:t>: {{CPF}}</w:t>
+      </w:r>
+      <w:r>
+        <w:rPr>
+          <w:rFonts w:eastAsia="Corsiva" w:cs="Corsiva"/>
+          <w:sz w:val="32"/>
+          <w:szCs w:val="32"/>
+        </w:rPr>
+        <w:t xml:space="preserve">                                                                                                               Reg.  CBMMG Nº F 0004348</w:t>
       </w:r>
     </w:p>
     <w:p>
       <w:pPr>
-        <w:ind w:left="284"/>
-        <w:rPr>
-          <w:rFonts w:asciiTheme="majorHAnsi" w:eastAsia="Corsiva" w:hAnsiTheme="majorHAnsi" w:cs="Corsiva"/>
-          <w:sz w:val="32"/>
-          <w:szCs w:val="32"/>
-        </w:rPr>
-      </w:pPr>
-    </w:p>
-    <w:p>
-      <w:pPr>
-        <w:ind w:left="284"/>
         <w:jc w:val="center"/>
         <w:rPr>
           <w:rFonts w:asciiTheme="majorHAnsi" w:eastAsia="Corsiva" w:hAnsiTheme="majorHAnsi" w:cs="Corsiva"/>

</xml_diff>